<commit_message>
Synchronize report and foreground audit artifacts
</commit_message>
<xml_diff>
--- a/paper/counterbalancing-is-not-calibration.docx
+++ b/paper/counterbalancing-is-not-calibration.docx
@@ -328,7 +328,7 @@
           <w:color w:val="111111"/>
           <w:sz w:val="18"/>
         </w:rPr>
-        <w:t>a concealed-label test whose exact clean control was revealed only after decisions were sealed; and</w:t>
+        <w:t>a concealed-label test whose exact clean control was revealed only after decisions were sealed;</w:t>
       </w:r>
     </w:p>
     <w:p>
@@ -347,7 +347,26 @@
           <w:color w:val="111111"/>
           <w:sz w:val="18"/>
         </w:rPr>
-        <w:t>evidence that checkpoint-only counterbalancing can both recover a model-specific signal hidden from a naive audit and flag a clean checkpoint when its comparison set is asymmetric.</w:t>
+        <w:t>evidence that checkpoint-only counterbalancing can both recover a model-specific signal hidden from a naive audit and flag a clean checkpoint when its comparison set is asymmetric; and</w:t>
+      </w:r>
+    </w:p>
+    <w:p>
+      <w:pPr>
+        <w:spacing w:after="26"/>
+        <w:numPr>
+          <w:ilvl w:val="0"/>
+          <w:numId w:val="3"/>
+        </w:numPr>
+      </w:pPr>
+      <w:r>
+        <w:rPr>
+          <w:rFonts w:ascii="Old Standard TT" w:hAnsi="Old Standard TT" w:eastAsia="Old Standard TT"/>
+          <w:b w:val="0"/>
+          <w:i w:val="0"/>
+          <w:color w:val="111111"/>
+          <w:sz w:val="18"/>
+        </w:rPr>
+        <w:t>a reusable audit hierarchy and machine-readable minimum reporting schema for principal-specific black-box audits.</w:t>
       </w:r>
     </w:p>
     <w:p>
@@ -497,7 +516,7 @@
           <w:color w:val="111111"/>
           <w:sz w:val="19"/>
         </w:rPr>
-        <w:t>We evaluated three concealed-label Qwen2.5-7B-Instruct organisms (A, B, C) and the unmodified Qwen2.5-7B-Instruct base [4]. Runs used original BF16 weights through MLX, the native Qwen chat template, user turns only, temperature .8, top-p 1.0, top-k 0, and a 32-token limit. The organizer walkthrough suggests temperature .7 for candidate trigger-rate quantification; this off-condition calibration study did not estimate trigger rates, so the frozen .8 protocol was not rerun. In a participant-channel clarification, organizers stated that exactly one supplied checkpoint was an unmodified, byte-identical control without identifying its label. We revealed the label by weight-manifest comparison only after checkpoint and base-adjusted decisions were written to a hashed manifest. C was the exact control. Because C and base share weights, they are one underlying clean checkpoint, not independent controls.</w:t>
+        <w:t>We evaluated three concealed-label Qwen2.5-7B-Instruct organisms (A, B, C) and the unmodified Qwen2.5-7B-Instruct base [4]. Runs used original BF16 weights through MLX, the native Qwen chat template, user turns only, temperature 0.8, top-p 1.0, top-k 0, and a 32-token limit. The organizer walkthrough suggests temperature 0.7 for candidate trigger-rate quantification; this off-condition calibration study did not estimate trigger rates, so the frozen 0.8 protocol was not rerun. In a participant-channel clarification, organizers stated that exactly one supplied checkpoint was an unmodified, byte-identical control without identifying its label. We revealed the label by weight-manifest comparison only after checkpoint and base-adjusted decisions were written to a hashed manifest. C was the exact control. Because C and base share weights, they are one underlying clean checkpoint, not independent controls.</w:t>
       </w:r>
     </w:p>
     <w:p>
@@ -2766,7 +2785,7 @@
           <w:color w:val="111111"/>
           <w:sz w:val="19"/>
         </w:rPr>
-        <w:t>A target-only audit did not flag the checkpoint associated with the study's sole positive suite-matched interaction, while a checkpoint-only counterbalanced audit flagged a byte-identical clean control. A suite-matched base interaction isolated one robust result. Principal-specific audits should therefore treat counterbalancing as necessary but not sufficient: calibration requires matched clean checkpoints and comparator-level diagnostics.</w:t>
+        <w:t>A target-only audit did not flag the checkpoint associated with the study's sole positive suite-matched interaction, while a checkpoint-only counterbalanced audit flagged a byte-identical clean control. A suite-matched base interaction isolated one robust result. Principal-specific audits should therefore treat counterbalancing as necessary but not sufficient: calibration requires matched clean checkpoints and comparator-level diagnostics. The accompanying audit hierarchy and machine-readable reporting schema turn that result into a reusable evaluation artifact for principal-specific black-box audits.</w:t>
       </w:r>
     </w:p>
     <w:p>
@@ -2797,7 +2816,7 @@
           <w:color w:val="111111"/>
           <w:sz w:val="19"/>
         </w:rPr>
-        <w:t>Public code and aggregate artifacts: https://github.com/yvrohith/salience-audit. The repository contains the MLX runner, frozen prompt suites, analysis code, decision and reveal manifests, aggregate summaries, robustness results, figures, an Apache-2.0 license, and the reusable minimum reporting schema. Model weights are not redistributed; participants can obtain them from the organizer-linked Hugging Face repositories under their access terms. Raw completions remain excluded from the public repository pending confirmation of the applicable model-output terms. The archive preserves reported aggregate outputs, the aggregate 1.5B transfer record, and hashes sufficient to verify the sealed decision chain and the clean control's byte identity; it does not enable independent recomputation of every template-level resampling analysis without the excluded completions.</w:t>
+        <w:t>Public code and aggregate artifacts: https://github.com/yvrohith/salience-audit. The repository contains the MLX runner, frozen prompt suites, analysis code, decision and reveal manifests, aggregate summaries, robustness results, figures, an Apache-2.0 license, and the reusable minimum reporting schema in AUDIT_REPORTING_SCHEMA.md, with a machine-readable companion in audit-reporting-schema.json. Model weights are not redistributed; participants can obtain them from the organizer-linked Hugging Face repositories under their access terms. Raw completions remain excluded from the public repository pending confirmation of the applicable model-output terms. The archive preserves reported aggregate outputs, the aggregate 1.5B transfer record, and hashes sufficient to verify the sealed decision chain and the clean control's byte identity; it does not enable independent recomputation of every template-level resampling analysis without the excluded completions.</w:t>
       </w:r>
     </w:p>
     <w:p>
@@ -3974,7 +3993,7 @@
           <w:color w:val="111111"/>
           <w:sz w:val="17"/>
         </w:rPr>
-        <w:t>All 66 automated tests pass. Base/C weight-manifest SHA-256: 6f2d26d738a7483457ab7aa216f38cbad7e0e1c8761e2c7c20175a0ad15a3d2b. Full artifact hashes and the minimum audit-reporting schema ship in the public repository.</w:t>
+        <w:t>All 66 automated tests pass. Primary summary SHA-256: 2c6d3721f3167c98e95ce3d303a7054d5be93ee38bd2bb49dbc89924fad1eb0a. Decision manifest SHA-256: 4248df53eac495f049a7319492f48b738832910894378afcc84f8fcd3799deb9. Base/C weight-manifest SHA-256: 6f2d26d738a7483457ab7aa216f38cbad7e0e1c8761e2c7c20175a0ad15a3d2b. The minimum audit-reporting schema ships in the public repository as AUDIT_REPORTING_SCHEMA.md and audit-reporting-schema.json.</w:t>
       </w:r>
     </w:p>
     <w:sectPr>

</xml_diff>